<commit_message>
feat: harden mobile infographic craft and P18 evidence
</commit_message>
<xml_diff>
--- a/examples/p18-synthetic-output-pack/renders/final/reopened/synthetic-cash-timing-report.docx
+++ b/examples/p18-synthetic-output-pack/renders/final/reopened/synthetic-cash-timing-report.docx
@@ -63,7 +63,7 @@
       </w:pPr>
       <w:r>
         <w:rPr/>
-        <w:t>With billings and cash costs held constant, longer collection delays deepen the temporary cash trough. In this artificial four-period example, the two-period delay creates a 45 SCU gap beyond the assumed 75 SCU buffer. The numbers demonstrate timing arithmetic only.</w:t>
+        <w:t>With billings and cash costs held constant, longer collection delays deepen the temporary cash trough. In this artificial four-period example, the largest scenario gap is 45 SCU beyond the assumed 75 SCU buffer. The numbers demonstrate timing arithmetic only.</w:t>
       </w:r>
     </w:p>
     <w:p>
@@ -1077,7 +1077,7 @@
           <wp:inline distT="0" distB="0" distL="0" distR="0">
             <wp:extent cx="4754880" cy="2674620"/>
             <wp:effectExtent l="0" t="0" r="0" b="0"/>
-            <wp:docPr id="1" name="Picture 1" descr="Three synthetic collection-delay cases show the gap beyond an assumed 75 SCU buffer: zero for no lag, zero for one-period lag, and 45 SCU for two-period lag."/>
+            <wp:docPr id="1" name="Picture 1" descr="Three synthetic collection-delay cases show the gap beyond the assumed 75 SCU buffer: 0-period lag: 0 SCU; 1-period lag: 0 SCU; 2-period lag: 45 SCU."/>
             <wp:cNvGraphicFramePr>
               <a:graphicFrameLocks xmlns:a="http://schemas.openxmlformats.org/drawingml/2006/main" noChangeAspect="1"/>
             </wp:cNvGraphicFramePr>
@@ -1085,7 +1085,7 @@
               <a:graphicData uri="http://schemas.openxmlformats.org/drawingml/2006/picture">
                 <pic:pic xmlns:pic="http://schemas.openxmlformats.org/drawingml/2006/picture">
                   <pic:nvPicPr>
-                    <pic:cNvPr id="1" name="Picture 1" descr="Three synthetic collection-delay cases show the gap beyond an assumed 75 SCU buffer: zero for no lag, zero for one-period lag, and 45 SCU for two-period lag."/>
+                    <pic:cNvPr id="1" name="Picture 1" descr="Three synthetic collection-delay cases show the gap beyond the assumed 75 SCU buffer: 0-period lag: 0 SCU; 1-period lag: 0 SCU; 2-period lag: 45 SCU."/>
                     <pic:cNvPicPr>
                       <a:picLocks noChangeAspect="1" noChangeArrowheads="1"/>
                     </pic:cNvPicPr>
@@ -1120,7 +1120,7 @@
       </w:pPr>
       <w:r>
         <w:rPr/>
-        <w:t>Figure 1. Only the two-period delay leaves a gap beyond the assumed buffer.</w:t>
+        <w:t>Figure 1. Scenario comparison of unfunded gaps beyond the assumed buffer.</w:t>
       </w:r>
     </w:p>
     <w:p>

</xml_diff>